<commit_message>
Google BIP resume -> 100% (SaaS honestly claimable per Kshitiz); add SaaS/platform framing to experience_bank
</commit_message>
<xml_diff>
--- a/resumes/Google-Product Manager BIP.docx
+++ b/resumes/Google-Product Manager BIP.docx
@@ -78,7 +78,7 @@
           <w:i w:val="0"/>
           <w:sz w:val="19"/>
         </w:rPr>
-        <w:t>Product Manager with 5+ years taking technical products from conception to launch (0 to 1) — including reporting and insights platforms and internal enterprise/platform tooling. Conducts market research and competitive analysis, translates customer needs into a prioritized roadmap, collaborates with engineering and design on specifications, user experience, and technical architecture, and drives launches, go-to-market, and adoption. Executes in ambiguity and influences cross-functional stakeholders. Track record of 20% revenue growth and ₹70L in product-led renewals.</w:t>
+        <w:t>Product Manager with 5+ years taking technical products from conception to launch (0 to 1) within a SaaS / software platform — including reporting and insights capabilities and internal enterprise/platform tooling. Conducts market research and competitive analysis, translates customer needs into a prioritized roadmap, collaborates with engineering and design on specifications, user experience, and technical architecture, and drives launches, go-to-market, and adoption. Executes in ambiguity and influences cross-functional stakeholders. Track record of 20% revenue growth and ₹70L in product-led renewals.</w:t>
       </w:r>
     </w:p>
     <w:p>
@@ -319,7 +319,7 @@
           <w:i w:val="0"/>
           <w:sz w:val="19"/>
         </w:rPr>
-        <w:t>Product Management · Conception to Launch (0→1) · Reporting &amp; Insights Platforms · Enterprise &amp; Platform Products/Tooling · Market Research, Customer Analysis &amp; Competitive Analysis · Product Roadmap &amp; Prioritization · Engineering &amp; Design Collaboration (Specifications, UX, Technical Architecture) · Product Launches, GTM &amp; Adoption · Product Performance &amp; Key Metrics · Customer Feedback · Cross-Functional Stakeholders (Product, Engineering, Analytics, Finance) · Execution in Ambiguity · Negotiation, Communication &amp; Influence · Data &amp; Analytics (SQL)</w:t>
+        <w:t>Product Management · Conception to Launch (0→1) within SaaS / Software Platforms · Reporting &amp; Insights Platforms · Enterprise &amp; Platform Products/Tooling · Market Research, Customer Analysis &amp; Competitive Analysis · Product Roadmap &amp; Prioritization · Engineering &amp; Design Collaboration (Specifications, UX, Technical Architecture) · Product Launches, GTM &amp; Adoption · Product Performance &amp; Key Metrics · Customer Feedback · Cross-Functional Stakeholders (Product, Engineering, Analytics, Finance) · Execution in Ambiguity · Negotiation, Communication &amp; Influence · Data &amp; Analytics (SQL)</w:t>
       </w:r>
     </w:p>
     <w:p>

</xml_diff>